<commit_message>
Added data cleaning for all source data - code only. Added dataset providence to report.
</commit_message>
<xml_diff>
--- a/report.docx
+++ b/report.docx
@@ -9,29 +9,187 @@
       <w:r>
         <w:t>DSM050</w:t>
       </w:r>
+      <w:r>
+        <w:t xml:space="preserve"> - </w:t>
+      </w:r>
+      <w:r>
+        <w:t>Disaggregating Global Wealth-Welfare Trends</w:t>
+      </w:r>
     </w:p>
-    <w:p/>
+    <w:p>
+      <w:pPr>
+        <w:pStyle w:val="Subtitle"/>
+      </w:pPr>
+      <w:r>
+        <w:t>Revealing Local Macroeconomic Archetypes Amid Extreme Data Sparsity</w:t>
+      </w:r>
+    </w:p>
     <w:p>
       <w:hyperlink r:id="rId4" w:history="1">
         <w:r>
           <w:rPr>
             <w:rStyle w:val="Hyperlink"/>
           </w:rPr>
-          <w:t>https://github.com/Soundscape/dsm050-m</w:t>
+          <w:t>https://github.com/Soundscape/dsm050-midterm</w:t>
         </w:r>
+      </w:hyperlink>
+    </w:p>
+    <w:p>
+      <w:pPr>
+        <w:pStyle w:val="Heading1"/>
+      </w:pPr>
+      <w:r>
+        <w:t>Datasets</w:t>
+      </w:r>
+    </w:p>
+    <w:p>
+      <w:r>
+        <w:rPr>
+          <w:i/>
+          <w:iCs/>
+        </w:rPr>
+        <w:t>ArcGIS - World Countries</w:t>
+      </w:r>
+      <w:r>
+        <w:t>a, . Available: </w:t>
+      </w:r>
+      <w:hyperlink r:id="rId5" w:tgtFrame="_blank" w:history="1">
         <w:r>
           <w:rPr>
             <w:rStyle w:val="Hyperlink"/>
           </w:rPr>
-          <w:t>i</w:t>
+          <w:t>https://hub.arcgis.com/datasets/esri::world-countries-generalized/about</w:t>
         </w:r>
+      </w:hyperlink>
+      <w:r>
+        <w:t>.</w:t>
+      </w:r>
+    </w:p>
+    <w:p>
+      <w:r>
+        <w:rPr>
+          <w:i/>
+          <w:iCs/>
+        </w:rPr>
+        <w:t>ILOSTAT - Social Welfare Coverage</w:t>
+      </w:r>
+      <w:r>
+        <w:t>b, . Available: </w:t>
+      </w:r>
+      <w:hyperlink r:id="rId6" w:tgtFrame="_blank" w:history="1">
         <w:r>
           <w:rPr>
             <w:rStyle w:val="Hyperlink"/>
           </w:rPr>
-          <w:t>dterm</w:t>
+          <w:t>https://rplumber.ilo.org/dataexplorer/?id=SDG_0131_SEX_SOC_RT_A&amp;timefrom=2015&amp;timeto=2025</w:t>
         </w:r>
       </w:hyperlink>
+      <w:r>
+        <w:t>.</w:t>
+      </w:r>
+    </w:p>
+    <w:p>
+      <w:r>
+        <w:rPr>
+          <w:i/>
+          <w:iCs/>
+        </w:rPr>
+        <w:t>World Bank Group - Per Capita GDP</w:t>
+      </w:r>
+      <w:r>
+        <w:t>c, . Available: </w:t>
+      </w:r>
+      <w:hyperlink r:id="rId7" w:tgtFrame="_blank" w:history="1">
+        <w:r>
+          <w:rPr>
+            <w:rStyle w:val="Hyperlink"/>
+          </w:rPr>
+          <w:t>https://data.worldbank.org/indicator/NY.GDP.PCAP.CD</w:t>
+        </w:r>
+      </w:hyperlink>
+      <w:r>
+        <w:t>.</w:t>
+      </w:r>
+    </w:p>
+    <w:p>
+      <w:r>
+        <w:rPr>
+          <w:i/>
+          <w:iCs/>
+        </w:rPr>
+        <w:t>World Bank Group - Population</w:t>
+      </w:r>
+      <w:r>
+        <w:t>d, . Available: </w:t>
+      </w:r>
+      <w:hyperlink r:id="rId8" w:tgtFrame="_blank" w:history="1">
+        <w:r>
+          <w:rPr>
+            <w:rStyle w:val="Hyperlink"/>
+          </w:rPr>
+          <w:t>https://data.worldbank.org/indicator/SP.POP.TOTL</w:t>
+        </w:r>
+      </w:hyperlink>
+      <w:r>
+        <w:t>.</w:t>
+      </w:r>
+    </w:p>
+    <w:p>
+      <w:r>
+        <w:rPr>
+          <w:i/>
+          <w:iCs/>
+        </w:rPr>
+        <w:t>World Bank Group - Social Welfare Coverage</w:t>
+      </w:r>
+      <w:r>
+        <w:t>e, . Available: </w:t>
+      </w:r>
+      <w:hyperlink r:id="rId9" w:tgtFrame="_blank" w:history="1">
+        <w:r>
+          <w:rPr>
+            <w:rStyle w:val="Hyperlink"/>
+          </w:rPr>
+          <w:t>https://data.worldbank.org/indicator/per_sa_allsa.cov_pop_tot</w:t>
+        </w:r>
+      </w:hyperlink>
+      <w:r>
+        <w:t>.</w:t>
+      </w:r>
+    </w:p>
+    <w:p>
+      <w:pPr>
+        <w:pStyle w:val="Heading1"/>
+      </w:pPr>
+      <w:r>
+        <w:t>References</w:t>
+      </w:r>
+    </w:p>
+    <w:p>
+      <w:r>
+        <w:t>Daniel Liberto 2026, May 02-last update</w:t>
+      </w:r>
+      <w:r>
+        <w:rPr>
+          <w:i/>
+          <w:iCs/>
+        </w:rPr>
+        <w:t>, Understanding Endogenous Growth Theory: Key Concepts and Critiques</w:t>
+      </w:r>
+      <w:r>
+        <w:t>. Available: </w:t>
+      </w:r>
+      <w:hyperlink r:id="rId10" w:tgtFrame="_blank" w:history="1">
+        <w:r>
+          <w:rPr>
+            <w:rStyle w:val="Hyperlink"/>
+          </w:rPr>
+          <w:t>https://www.investopedia.com/terms/e/endogenousgrowththeory.asp</w:t>
+        </w:r>
+      </w:hyperlink>
+      <w:r>
+        <w:t> [2026, June 28].</w:t>
+      </w:r>
     </w:p>
     <w:sectPr>
       <w:pgSz w:w="11906" w:h="16838"/>
@@ -471,7 +629,6 @@
     <w:next w:val="Normal"/>
     <w:link w:val="Heading2Char"/>
     <w:uiPriority w:val="9"/>
-    <w:semiHidden/>
     <w:unhideWhenUsed/>
     <w:qFormat/>
     <w:rsid w:val="00377D67"/>
@@ -494,7 +651,6 @@
     <w:next w:val="Normal"/>
     <w:link w:val="Heading3Char"/>
     <w:uiPriority w:val="9"/>
-    <w:semiHidden/>
     <w:unhideWhenUsed/>
     <w:qFormat/>
     <w:rsid w:val="00377D67"/>
@@ -687,7 +843,6 @@
     <w:basedOn w:val="DefaultParagraphFont"/>
     <w:link w:val="Heading2"/>
     <w:uiPriority w:val="9"/>
-    <w:semiHidden/>
     <w:rsid w:val="00377D67"/>
     <w:rPr>
       <w:rFonts w:asciiTheme="majorHAnsi" w:eastAsiaTheme="majorEastAsia" w:hAnsiTheme="majorHAnsi" w:cstheme="majorBidi"/>
@@ -701,7 +856,6 @@
     <w:basedOn w:val="DefaultParagraphFont"/>
     <w:link w:val="Heading3"/>
     <w:uiPriority w:val="9"/>
-    <w:semiHidden/>
     <w:rsid w:val="00377D67"/>
     <w:rPr>
       <w:rFonts w:eastAsiaTheme="majorEastAsia" w:cstheme="majorBidi"/>

</xml_diff>

<commit_message>
Added research questions and expanded  data cleaning to explain each set and the methodology
</commit_message>
<xml_diff>
--- a/report.docx
+++ b/report.docx
@@ -95,7 +95,15 @@
     </w:p>
     <w:p>
       <w:r>
-        <w:t xml:space="preserve">This global alignment indicates that local countries may possess notably different structural characteristics that are obscured by aggregation. Aggregation flattens localised trends, thereby masking critical national differences. This can easily conceal localised national </w:t>
+        <w:t xml:space="preserve">This global alignment indicates that local countries may possess notably different structural characteristics that </w:t>
+      </w:r>
+      <w:proofErr w:type="gramStart"/>
+      <w:r>
+        <w:t>are obscured</w:t>
+      </w:r>
+      <w:proofErr w:type="gramEnd"/>
+      <w:r>
+        <w:t xml:space="preserve"> by aggregation. Aggregation flattens localised trends, thereby masking critical national differences. This can easily conceal localised national </w:t>
       </w:r>
       <w:r>
         <w:t>occurrences</w:t>
@@ -151,7 +159,13 @@
         <w:t>Develop a classification matrix:</w:t>
       </w:r>
       <w:r>
-        <w:t xml:space="preserve"> Utilise wealth, population, and social welfare coverage indicators to categorise countries in accordance with established macroeconomic types.</w:t>
+        <w:t xml:space="preserve"> </w:t>
+      </w:r>
+      <w:r>
+        <w:t>Use</w:t>
+      </w:r>
+      <w:r>
+        <w:t xml:space="preserve"> wealth, population, and social welfare coverage indicators to categorise countries in accordance with established macroeconomic types.</w:t>
       </w:r>
     </w:p>
     <w:p>
@@ -200,7 +214,15 @@
         <w:t>Developmental State / Endogenous Growth:</w:t>
       </w:r>
       <w:r>
-        <w:t xml:space="preserve"> Endogenous growth theory posits that economic growth is driven by internal factors like human capital, innovation, and investment rather than external forces, (Liberto, 2026). In a developmental state, the government acts as the primary mechanism for guiding this endogenous growth, strategically deploying resources to aid the economic drivers (Romeconomics.com).</w:t>
+        <w:t xml:space="preserve"> Endogenous growth theory posits that economic growth </w:t>
+      </w:r>
+      <w:proofErr w:type="gramStart"/>
+      <w:r>
+        <w:t>is driven</w:t>
+      </w:r>
+      <w:proofErr w:type="gramEnd"/>
+      <w:r>
+        <w:t xml:space="preserve"> by internal factors like human capital, innovation, and investment rather than external forces, (Liberto, 2026). In a developmental state, the government acts as the primary mechanism for guiding this endogenous growth, strategically deploying resources to aid the economic drivers (Romeconomics.com).</w:t>
       </w:r>
     </w:p>
     <w:p>
@@ -219,7 +241,15 @@
         <w:t>Market-driven Economy:</w:t>
       </w:r>
       <w:r>
-        <w:t xml:space="preserve"> A market economy relies on competition and trade with minimal government interferences, (Lohr &amp; MTS, 2019). Within this system, social welfare expenditure is expected to be minimal, as the market serves as an efficient distribution mechanism, allowing the population to procure services through private capital.</w:t>
+        <w:t xml:space="preserve"> A market economy relies on competition and trade with minimal government interferences, (Lohr &amp; MTS, 2019). Within this system, social welfare expenditure </w:t>
+      </w:r>
+      <w:proofErr w:type="gramStart"/>
+      <w:r>
+        <w:t>is expected</w:t>
+      </w:r>
+      <w:proofErr w:type="gramEnd"/>
+      <w:r>
+        <w:t xml:space="preserve"> to be minimal, as the market serves as an efficient distribution mechanism, allowing the population to procure services through private capital.</w:t>
       </w:r>
     </w:p>
     <w:p>
@@ -245,7 +275,15 @@
         <w:t>:</w:t>
       </w:r>
       <w:r>
-        <w:t xml:space="preserve"> Public sector expansion can sometimes function as an inefficient mechanism for wealth redistribution that is tightly bound to political patronage Robinson et al., 2013. Social welfare can become an extension of this dynamic, trapping populations in welfare dependency. Both approaches link capital to political power and can thus become predatory in nature. This is often seen in countries experiencing financial deterioration, where the state expands both social welfare and public sector employment to shield the population while simultaneously securing voting blocs. This leads to an unsustainable system of artificial stability.</w:t>
+        <w:t xml:space="preserve"> Public sector expansion can sometimes function as an inefficient mechanism for wealth redistribution that is tightly bound to political patronage Robinson et al., 2013. Social welfare can become an extension of this dynamic, trapping populations in welfare dependency. Both approaches link capital to political power and can thus become predatory in nature. This </w:t>
+      </w:r>
+      <w:proofErr w:type="gramStart"/>
+      <w:r>
+        <w:t>is often seen</w:t>
+      </w:r>
+      <w:proofErr w:type="gramEnd"/>
+      <w:r>
+        <w:t xml:space="preserve"> in countries experiencing financial deterioration, where the state expands both social welfare and public sector employment to shield the population while simultaneously securing voting blocs. This leads to an unsustainable system of artificial stability.</w:t>
       </w:r>
     </w:p>
     <w:p>
@@ -296,7 +334,15 @@
         <w:t>Development policymakers and aid agencies:</w:t>
       </w:r>
       <w:r>
-        <w:t xml:space="preserve"> For these stakeholders, the disaggregated model emphasises that sustainable development strategies must be tailored to a nation's specific, long-term institutional archetype rather than broad regional or global averages.</w:t>
+        <w:t xml:space="preserve"> For these stakeholders, the disaggregated model emphasises that sustainable development strategies must </w:t>
+      </w:r>
+      <w:proofErr w:type="gramStart"/>
+      <w:r>
+        <w:t>be tailored</w:t>
+      </w:r>
+      <w:proofErr w:type="gramEnd"/>
+      <w:r>
+        <w:t xml:space="preserve"> to a nation's specific, long-term institutional archetype rather than broad regional or global averages.</w:t>
       </w:r>
     </w:p>
     <w:p>
@@ -339,6 +385,274 @@
       </w:r>
     </w:p>
     <w:p/>
+    <w:p>
+      <w:pPr>
+        <w:pStyle w:val="Heading2"/>
+      </w:pPr>
+      <w:r>
+        <w:t>Research Questions</w:t>
+      </w:r>
+    </w:p>
+    <w:p>
+      <w:pPr>
+        <w:rPr>
+          <w:b/>
+          <w:bCs/>
+        </w:rPr>
+      </w:pPr>
+      <w:r>
+        <w:rPr>
+          <w:b/>
+          <w:bCs/>
+        </w:rPr>
+        <w:t>How does the strong positive global correlation between per capita GDP and social welfare coverage obscure localised economic paths of individual nations over time?</w:t>
+      </w:r>
+    </w:p>
+    <w:p>
+      <w:r>
+        <w:t xml:space="preserve">When we look at aggregated correlation in the global pool, we discover a strong positive relationship between per capita GDP and the coverage of social welfare. This pattern supports Wagner's Law which indicates that as a country's wealth grows, so too does its social spending. As </w:t>
+      </w:r>
+      <w:r>
+        <w:t>noted</w:t>
+      </w:r>
+      <w:r>
+        <w:t xml:space="preserve"> by Wagner and Weber (1977), this is not a universal law when looking at individual countries. </w:t>
+      </w:r>
+      <w:proofErr w:type="gramStart"/>
+      <w:r>
+        <w:t>Many</w:t>
+      </w:r>
+      <w:proofErr w:type="gramEnd"/>
+      <w:r>
+        <w:t xml:space="preserve"> of the observed countries did not match the pattern established in Wagner's Law. For this reason, we suspect that the global aggregation hides the localised interplays between these variables at the national level.</w:t>
+      </w:r>
+    </w:p>
+    <w:p>
+      <w:r>
+        <w:t xml:space="preserve">By plotting individual, disaggregated trajectories against the global pooled baseline, this question critically </w:t>
+      </w:r>
+      <w:r>
+        <w:t>evaluates</w:t>
+      </w:r>
+      <w:r>
+        <w:t xml:space="preserve"> whether universal macroeconomic laws like Wagner’s Law hold true internally, or if they are merely statistical illusions created by aggregating stratified global layers. This could hold significant importance for international bodies (such as the IMF) as it </w:t>
+      </w:r>
+      <w:proofErr w:type="gramStart"/>
+      <w:r>
+        <w:t>is often assumed</w:t>
+      </w:r>
+      <w:proofErr w:type="gramEnd"/>
+      <w:r>
+        <w:t xml:space="preserve"> that relationships observed at the global level will hold for individual states. If the local trajectories diverge significantly from the observed global average, it proves that uniform global baselines are insufficient for local economic diagnostic </w:t>
+      </w:r>
+      <w:r>
+        <w:t>modelling</w:t>
+      </w:r>
+      <w:r>
+        <w:t>.</w:t>
+      </w:r>
+    </w:p>
+    <w:p/>
+    <w:p>
+      <w:pPr>
+        <w:rPr>
+          <w:b/>
+          <w:bCs/>
+        </w:rPr>
+      </w:pPr>
+      <w:r>
+        <w:rPr>
+          <w:b/>
+          <w:bCs/>
+        </w:rPr>
+        <w:t xml:space="preserve">How can countries </w:t>
+      </w:r>
+      <w:proofErr w:type="gramStart"/>
+      <w:r>
+        <w:rPr>
+          <w:b/>
+          <w:bCs/>
+        </w:rPr>
+        <w:t>be clustered</w:t>
+      </w:r>
+      <w:proofErr w:type="gramEnd"/>
+      <w:r>
+        <w:rPr>
+          <w:b/>
+          <w:bCs/>
+        </w:rPr>
+        <w:t xml:space="preserve"> into distinct functional archetypes using their internal population-to-wealth and population-to-welfare tracking?</w:t>
+      </w:r>
+    </w:p>
+    <w:p/>
+    <w:p>
+      <w:r>
+        <w:lastRenderedPageBreak/>
+        <w:t xml:space="preserve">Esping-Andersen’s (1990) </w:t>
+      </w:r>
+      <w:r>
+        <w:t>farmwork</w:t>
+      </w:r>
+      <w:r>
+        <w:t xml:space="preserve">, The Three Worlds of Welfare Capitalism, classifies states into distinct regimes (Liberal, Corporatist, Social Democratic) based on how they insulate citizens from market forces. This framework has since </w:t>
+      </w:r>
+      <w:proofErr w:type="gramStart"/>
+      <w:r>
+        <w:t>been expanded</w:t>
+      </w:r>
+      <w:proofErr w:type="gramEnd"/>
+      <w:r>
+        <w:t xml:space="preserve"> through the introduction of new classifications such as the developmental state, where social spending </w:t>
+      </w:r>
+      <w:proofErr w:type="gramStart"/>
+      <w:r>
+        <w:t>is seen</w:t>
+      </w:r>
+      <w:proofErr w:type="gramEnd"/>
+      <w:r>
+        <w:t xml:space="preserve"> as an investment in human capital to fuel growth (Romeconomics.com).</w:t>
+      </w:r>
+    </w:p>
+    <w:p>
+      <w:r>
+        <w:t xml:space="preserve">This research question seeks to mathematically distribute states in the direction of their internal correlations. Countries expanding both wealth and welfare relative to population growth match the A-1 Developmental State archetype in which the state invests wealth in the population to expand endogenous growth. Countries experiencing </w:t>
+      </w:r>
+      <w:proofErr w:type="gramStart"/>
+      <w:r>
+        <w:t>positive growth</w:t>
+      </w:r>
+      <w:proofErr w:type="gramEnd"/>
+      <w:r>
+        <w:t xml:space="preserve"> in wealth alongside a contraction of social welfare spending map to the A-2 Market </w:t>
+      </w:r>
+      <w:r>
+        <w:t>Economy</w:t>
+      </w:r>
+      <w:r>
+        <w:t xml:space="preserve"> archetype in which the state </w:t>
+      </w:r>
+      <w:r>
+        <w:t>reduces</w:t>
+      </w:r>
+      <w:r>
+        <w:t xml:space="preserve"> social spending and instead </w:t>
+      </w:r>
+      <w:r>
+        <w:t>focuses</w:t>
+      </w:r>
+      <w:r>
+        <w:t xml:space="preserve"> on the true responsibilities of state such as internal and external security, and infrastructure. Here the market acts as an efficient mechanism to distribute wealth, allowing the population to procure services </w:t>
+      </w:r>
+      <w:r>
+        <w:t>using</w:t>
+      </w:r>
+      <w:r>
+        <w:t xml:space="preserve"> private capital. Conversely, countries that expand social spending while experiencing a deterioration of wealth, may fall into the B-1 </w:t>
+      </w:r>
+      <w:r>
+        <w:t>Clientelist</w:t>
+      </w:r>
+      <w:r>
+        <w:t xml:space="preserve"> State archetype in which the state uses social spending to maintain political stability and reduce social unrest during the decline. Finally, countries that experience declining wealth and social spending fall into the B-2 archetype of Demographic Realignment. In this case, developing nations may be experiencing fiscal collapse due to population outpacing both private capital and state capacity for social spending. More advanced economies experiencing this may be reverting to a steady-state trend that aligns with severe changing in demographics, such as an expanding elderly population.</w:t>
+      </w:r>
+    </w:p>
+    <w:p>
+      <w:r>
+        <w:t>This question turns abstract economic theories into mathematical classifications. By looking at localised trajectories of individual countries, we can determine if states naturally cluster into reliable, long-term archetypes, or if they behave chaotically.</w:t>
+      </w:r>
+    </w:p>
+    <w:p/>
+    <w:p>
+      <w:pPr>
+        <w:rPr>
+          <w:b/>
+          <w:bCs/>
+        </w:rPr>
+      </w:pPr>
+      <w:r>
+        <w:rPr>
+          <w:b/>
+          <w:bCs/>
+        </w:rPr>
+        <w:t>Does the global spatial mapping of disaggregated national archetypes challenge regional stereotypes?</w:t>
+      </w:r>
+    </w:p>
+    <w:p>
+      <w:r>
+        <w:t xml:space="preserve">In the public domain, broad geographic regions </w:t>
+      </w:r>
+      <w:proofErr w:type="gramStart"/>
+      <w:r>
+        <w:t>are often labelled</w:t>
+      </w:r>
+      <w:proofErr w:type="gramEnd"/>
+      <w:r>
+        <w:t xml:space="preserve"> with sweeping generalisations. Sub-Saharan Africa</w:t>
+      </w:r>
+      <w:proofErr w:type="gramStart"/>
+      <w:r>
+        <w:t>, in particular, is</w:t>
+      </w:r>
+      <w:proofErr w:type="gramEnd"/>
+      <w:r>
+        <w:t xml:space="preserve"> frequently </w:t>
+      </w:r>
+      <w:r>
+        <w:t>portrayed</w:t>
+      </w:r>
+      <w:r>
+        <w:t xml:space="preserve"> as a homogenous set of states locked in a cycle of institutional fragility, fiscal collapse, and foreign aid dependency.</w:t>
+      </w:r>
+    </w:p>
+    <w:p>
+      <w:r>
+        <w:t xml:space="preserve">These </w:t>
+      </w:r>
+      <w:r>
+        <w:t>stereotypes</w:t>
+      </w:r>
+      <w:r>
+        <w:t xml:space="preserve"> </w:t>
+      </w:r>
+      <w:proofErr w:type="gramStart"/>
+      <w:r>
+        <w:t>are challenged</w:t>
+      </w:r>
+      <w:proofErr w:type="gramEnd"/>
+      <w:r>
+        <w:t xml:space="preserve"> by modern institutional economists like Acemoglu and Robinson (2012), who argue that man-made political and economic institutions that underlie economic success within individual nations. This question leverages the global choropleth map visually </w:t>
+      </w:r>
+      <w:r>
+        <w:t>evaluate</w:t>
+      </w:r>
+      <w:r>
+        <w:t xml:space="preserve"> this hypothesis. If the map reveals a diverse set </w:t>
+      </w:r>
+      <w:r>
+        <w:lastRenderedPageBreak/>
+        <w:t xml:space="preserve">of classifications across developing continents, specifically showing a strong presence of A-1 and A-2 </w:t>
+      </w:r>
+      <w:r>
+        <w:t>archetypes</w:t>
+      </w:r>
+      <w:r>
+        <w:t xml:space="preserve">, it provides </w:t>
+      </w:r>
+      <w:r>
+        <w:t>empirically</w:t>
+      </w:r>
+      <w:r>
+        <w:t xml:space="preserve"> proof that </w:t>
+      </w:r>
+      <w:proofErr w:type="gramStart"/>
+      <w:r>
+        <w:t>many</w:t>
+      </w:r>
+      <w:proofErr w:type="gramEnd"/>
+      <w:r>
+        <w:t xml:space="preserve"> developing nations maintain healthy, progressive wealth-and-welfare growth tracks.</w:t>
+      </w:r>
+    </w:p>
     <w:p>
       <w:pPr>
         <w:pStyle w:val="Heading1"/>
@@ -1483,6 +1797,7 @@
   <w:style w:type="character" w:default="1" w:styleId="DefaultParagraphFont">
     <w:name w:val="Default Paragraph Font"/>
     <w:uiPriority w:val="1"/>
+    <w:semiHidden/>
     <w:unhideWhenUsed/>
   </w:style>
   <w:style w:type="table" w:default="1" w:styleId="TableNormal">

</xml_diff>